<commit_message>
Lab 4 and Lab 5 updated
</commit_message>
<xml_diff>
--- a/Labs/Lab_4/lab4_logisim_solutions.docx
+++ b/Labs/Lab_4/lab4_logisim_solutions.docx
@@ -5,6 +5,7 @@
     <w:p>
       <w:pPr>
         <w:spacing w:after="60"/>
+        <w:ind w:firstLine="720"/>
         <w:jc w:val="center"/>
         <w:rPr>
           <w:b/>
@@ -266,9 +267,13 @@
     <w:p>
       <w:pPr>
         <w:spacing w:after="60"/>
+        <w:rPr>
+          <w:lang w:val="ru-RU"/>
+        </w:rPr>
       </w:pPr>
       <w:r>
         <w:rPr>
+          <w:noProof/>
           <w:lang w:val="ru-RU"/>
         </w:rPr>
         <w:drawing>
@@ -319,6 +324,7 @@
         <w:rPr>
           <w:b/>
           <w:bCs/>
+          <w:lang w:val="ru-RU"/>
         </w:rPr>
         <w:t>:</w:t>
       </w:r>
@@ -332,6 +338,7 @@
       </w:pPr>
       <w:r>
         <w:rPr>
+          <w:noProof/>
           <w:lang w:val="ru-RU"/>
         </w:rPr>
         <w:drawing>
@@ -408,6 +415,7 @@
         <w:rPr>
           <w:b/>
           <w:bCs/>
+          <w:noProof/>
         </w:rPr>
         <w:drawing>
           <wp:inline distT="0" distB="0" distL="0" distR="0" wp14:anchorId="40A97E88" wp14:editId="4BA21D5B">
@@ -1513,6 +1521,7 @@
       <w:r>
         <w:rPr>
           <w:b/>
+          <w:noProof/>
           <w:lang w:val="ru-RU"/>
         </w:rPr>
         <w:drawing>
@@ -1563,6 +1572,7 @@
       <w:r>
         <w:rPr>
           <w:b/>
+          <w:noProof/>
           <w:lang w:val="ru-RU"/>
         </w:rPr>
         <w:drawing>
@@ -1613,6 +1623,7 @@
       <w:r>
         <w:rPr>
           <w:b/>
+          <w:noProof/>
           <w:lang w:val="ru-RU"/>
         </w:rPr>
         <w:lastRenderedPageBreak/>
@@ -1664,6 +1675,7 @@
       <w:r>
         <w:rPr>
           <w:b/>
+          <w:noProof/>
           <w:lang w:val="ru-RU"/>
         </w:rPr>
         <w:drawing>
@@ -1919,6 +1931,7 @@
       </w:pPr>
       <w:r>
         <w:rPr>
+          <w:noProof/>
           <w:lang w:val="ru-RU"/>
         </w:rPr>
         <w:lastRenderedPageBreak/>
@@ -1957,6 +1970,17 @@
             </a:graphic>
           </wp:inline>
         </w:drawing>
+      </w:r>
+    </w:p>
+    <w:p>
+      <w:pPr>
+        <w:spacing w:after="60"/>
+      </w:pPr>
+      <w:r>
+        <w:rPr>
+          <w:lang w:val="ru-RU"/>
+        </w:rPr>
+        <w:t>Мультиплексор выбирает один информационный вход и передаёт его значение на выход</w:t>
       </w:r>
     </w:p>
     <w:p>
@@ -2930,6 +2954,7 @@
         <w:rPr>
           <w:lang w:val="ru-RU"/>
         </w:rPr>
+        <w:lastRenderedPageBreak/>
         <w:t>При каждом запуске реально вычисляются все четыре операции одновременно. Мультиплексор не выполняет операцию сам — он только выбирает, результат какой операции передать на выход.</w:t>
       </w:r>
     </w:p>
@@ -2944,7 +2969,6 @@
         <w:rPr>
           <w:lang w:val="ru-RU"/>
         </w:rPr>
-        <w:lastRenderedPageBreak/>
         <w:t>Так схема работает быстро: после вычисления результатов нужно только выбрать один из них. Недостаток — требуется больше логических элементов, потому что аппаратные блоки всех операций присутствуют одновременно.</w:t>
       </w:r>
     </w:p>
@@ -2982,20 +3006,20 @@
       <w:pPr>
         <w:spacing w:after="60"/>
         <w:rPr>
-          <w:lang/>
+          <w:lang w:val="ru-RU"/>
         </w:rPr>
       </w:pPr>
       <w:r>
         <w:rPr>
           <w:b/>
           <w:bCs/>
-          <w:lang/>
+          <w:lang w:val="ru-RU"/>
         </w:rPr>
         <w:t>1. Красный и синий провод</w:t>
       </w:r>
       <w:r>
         <w:rPr>
-          <w:lang/>
+          <w:lang w:val="ru-RU"/>
         </w:rPr>
         <w:br/>
         <w:t>Красный означает ошибку сигнала, например когда соединённые выходы одновременно выдают 0 и 1. Синий означает, что значение неизвестно: например, вход не подключён.</w:t>
@@ -3005,35 +3029,97 @@
       <w:pPr>
         <w:spacing w:after="60"/>
         <w:rPr>
-          <w:lang/>
+          <w:lang w:val="ru-RU"/>
         </w:rPr>
       </w:pPr>
       <w:r>
         <w:rPr>
           <w:b/>
           <w:bCs/>
-          <w:lang/>
+          <w:lang w:val="ru-RU"/>
         </w:rPr>
         <w:t>2. Выходы дешифратора</w:t>
       </w:r>
       <w:r>
         <w:rPr>
-          <w:lang/>
+          <w:lang w:val="ru-RU"/>
         </w:rPr>
         <w:br/>
-        <w:t xml:space="preserve">Каждый выход соответствует ровно одной комбинации входов. Например, для комбинации A = 1, B = 0 выход задаётся выражением </w:t>
+        <w:t xml:space="preserve">Каждый выход соответствует ровно одной комбинации входов. Например, для комбинации </w:t>
+      </w:r>
+      <w:r>
+        <w:t>A</w:t>
+      </w:r>
+      <w:r>
+        <w:rPr>
+          <w:lang w:val="ru-RU"/>
+        </w:rPr>
+        <w:t xml:space="preserve"> = 1, </w:t>
+      </w:r>
+      <w:r>
+        <w:t>B</w:t>
+      </w:r>
+      <w:r>
+        <w:rPr>
+          <w:lang w:val="ru-RU"/>
+        </w:rPr>
+        <w:t xml:space="preserve"> = 0 выход задаётся выражением </w:t>
       </w:r>
       <w:r>
         <w:rPr>
           <w:b/>
           <w:bCs/>
-          <w:lang/>
-        </w:rPr>
-        <w:t>A AND NOT B</w:t>
-      </w:r>
-      <w:r>
-        <w:rPr>
-          <w:lang/>
+        </w:rPr>
+        <w:t>A</w:t>
+      </w:r>
+      <w:r>
+        <w:rPr>
+          <w:b/>
+          <w:bCs/>
+          <w:lang w:val="ru-RU"/>
+        </w:rPr>
+        <w:t xml:space="preserve"> </w:t>
+      </w:r>
+      <w:r>
+        <w:rPr>
+          <w:b/>
+          <w:bCs/>
+        </w:rPr>
+        <w:t>AND</w:t>
+      </w:r>
+      <w:r>
+        <w:rPr>
+          <w:b/>
+          <w:bCs/>
+          <w:lang w:val="ru-RU"/>
+        </w:rPr>
+        <w:t xml:space="preserve"> </w:t>
+      </w:r>
+      <w:r>
+        <w:rPr>
+          <w:b/>
+          <w:bCs/>
+        </w:rPr>
+        <w:t>NOT</w:t>
+      </w:r>
+      <w:r>
+        <w:rPr>
+          <w:b/>
+          <w:bCs/>
+          <w:lang w:val="ru-RU"/>
+        </w:rPr>
+        <w:t xml:space="preserve"> </w:t>
+      </w:r>
+      <w:r>
+        <w:rPr>
+          <w:b/>
+          <w:bCs/>
+        </w:rPr>
+        <w:t>B</w:t>
+      </w:r>
+      <w:r>
+        <w:rPr>
+          <w:lang w:val="ru-RU"/>
         </w:rPr>
         <w:t>. Такое выражение называется минтермом.</w:t>
       </w:r>
@@ -3042,20 +3128,20 @@
       <w:pPr>
         <w:spacing w:after="60"/>
         <w:rPr>
-          <w:lang/>
+          <w:lang w:val="ru-RU"/>
         </w:rPr>
       </w:pPr>
       <w:r>
         <w:rPr>
           <w:b/>
           <w:bCs/>
-          <w:lang/>
+          <w:lang w:val="ru-RU"/>
         </w:rPr>
         <w:t>3. Что общего у дешифратора и мультиплексора?</w:t>
       </w:r>
       <w:r>
         <w:rPr>
-          <w:lang/>
+          <w:lang w:val="ru-RU"/>
         </w:rPr>
         <w:br/>
         <w:t>Оба распознают комбинацию управляющих битов. Дешифратор включает соответствующий выход, а мультиплексор по этой комбинации выбирает информационный вход.</w:t>
@@ -3065,20 +3151,20 @@
       <w:pPr>
         <w:spacing w:after="60"/>
         <w:rPr>
-          <w:lang/>
+          <w:lang w:val="ru-RU"/>
         </w:rPr>
       </w:pPr>
       <w:r>
         <w:rPr>
           <w:b/>
           <w:bCs/>
-          <w:lang/>
+          <w:lang w:val="ru-RU"/>
         </w:rPr>
         <w:t>4. Почему полный сумматор — отдельная подсхема?</w:t>
       </w:r>
       <w:r>
         <w:rPr>
-          <w:lang/>
+          <w:lang w:val="ru-RU"/>
         </w:rPr>
         <w:br/>
         <w:t>Он понадобится несколько раз для сборки четырёхразрядного сумматора. Подсхему удобно вставить четыре раза. Полусумматор проще и в том задании не требовал такого повторного использования.</w:t>
@@ -3088,20 +3174,35 @@
       <w:pPr>
         <w:spacing w:after="60"/>
         <w:rPr>
-          <w:lang/>
+          <w:lang w:val="ru-RU"/>
         </w:rPr>
       </w:pPr>
       <w:r>
         <w:rPr>
           <w:b/>
           <w:bCs/>
-          <w:lang/>
-        </w:rPr>
-        <w:t>5. Что означает C4 = 1?</w:t>
-      </w:r>
-      <w:r>
-        <w:rPr>
-          <w:lang/>
+          <w:lang w:val="ru-RU"/>
+        </w:rPr>
+        <w:t xml:space="preserve">5. Что означает </w:t>
+      </w:r>
+      <w:r>
+        <w:rPr>
+          <w:b/>
+          <w:bCs/>
+        </w:rPr>
+        <w:t>C</w:t>
+      </w:r>
+      <w:r>
+        <w:rPr>
+          <w:b/>
+          <w:bCs/>
+          <w:lang w:val="ru-RU"/>
+        </w:rPr>
+        <w:t>4 = 1?</w:t>
+      </w:r>
+      <w:r>
+        <w:rPr>
+          <w:lang w:val="ru-RU"/>
         </w:rPr>
         <w:br/>
         <w:t xml:space="preserve">Это перенос за пределы четырёх разрядов — пятый бит результата. Например, </w:t>
@@ -3110,108 +3211,176 @@
         <w:rPr>
           <w:b/>
           <w:bCs/>
-          <w:lang/>
+          <w:lang w:val="ru-RU"/>
         </w:rPr>
         <w:t>1111₂ + 0001₂ = 10000₂</w:t>
       </w:r>
       <w:r>
         <w:rPr>
-          <w:lang/>
-        </w:rPr>
-        <w:t>: четыре выхода суммы равны 0, а C4 равен</w:t>
-      </w:r>
-      <w:r>
-        <w:t xml:space="preserve"> </w:t>
-      </w:r>
-      <w:r>
-        <w:rPr>
-          <w:lang/>
-        </w:rPr>
-        <w:t>1.</w:t>
+          <w:lang w:val="ru-RU"/>
+        </w:rPr>
+        <w:t xml:space="preserve">: четыре выхода суммы равны 0, а </w:t>
+      </w:r>
+      <w:r>
+        <w:t>C</w:t>
+      </w:r>
+      <w:r>
+        <w:rPr>
+          <w:lang w:val="ru-RU"/>
+        </w:rPr>
+        <w:t>4 равен 1.</w:t>
       </w:r>
     </w:p>
     <w:p>
       <w:pPr>
         <w:spacing w:after="60"/>
         <w:rPr>
-          <w:lang/>
+          <w:lang w:val="ru-RU"/>
         </w:rPr>
       </w:pPr>
       <w:r>
         <w:rPr>
           <w:b/>
           <w:bCs/>
-          <w:lang/>
-        </w:rPr>
-        <w:t>6. Почему OR можно собрать из NAND?</w:t>
-      </w:r>
-      <w:r>
-        <w:rPr>
-          <w:lang/>
-        </w:rPr>
-        <w:br/>
-        <w:t xml:space="preserve">По </w:t>
+          <w:lang w:val="ru-RU"/>
+        </w:rPr>
+        <w:t xml:space="preserve">6. Почему </w:t>
       </w:r>
       <w:r>
         <w:rPr>
           <w:b/>
           <w:bCs/>
-          <w:lang/>
-        </w:rPr>
-        <w:t>закону де Моргана</w:t>
-      </w:r>
-      <w:r>
-        <w:rPr>
-          <w:lang/>
-        </w:rPr>
-        <w:t>:</w:t>
-      </w:r>
-      <w:r>
-        <w:rPr>
-          <w:lang/>
-        </w:rPr>
-        <w:br/>
+        </w:rPr>
+        <w:t>OR</w:t>
       </w:r>
       <w:r>
         <w:rPr>
           <w:b/>
           <w:bCs/>
-          <w:lang/>
-        </w:rPr>
-        <w:t>A OR B = NOT(NOT A AND NOT B)</w:t>
-      </w:r>
-      <w:r>
-        <w:rPr>
-          <w:lang/>
-        </w:rPr>
+          <w:lang w:val="ru-RU"/>
+        </w:rPr>
+        <w:t xml:space="preserve"> можно собрать из </w:t>
+      </w:r>
+      <w:r>
+        <w:rPr>
+          <w:b/>
+          <w:bCs/>
+        </w:rPr>
+        <w:t>NAND</w:t>
+      </w:r>
+      <w:r>
+        <w:rPr>
+          <w:b/>
+          <w:bCs/>
+          <w:lang w:val="ru-RU"/>
+        </w:rPr>
+        <w:t>?</w:t>
+      </w:r>
+      <w:r>
+        <w:rPr>
+          <w:lang w:val="ru-RU"/>
+        </w:rPr>
+        <w:br/>
+      </w:r>
+      <w:r>
+        <w:t xml:space="preserve">По </w:t>
+      </w:r>
+      <w:r>
+        <w:rPr>
+          <w:b/>
+          <w:bCs/>
+        </w:rPr>
+        <w:t>закону де Моргана</w:t>
+      </w:r>
+      <w:r>
+        <w:t>:</w:t>
+      </w:r>
+      <w:r>
+        <w:br/>
+      </w:r>
+      <w:r>
+        <w:rPr>
+          <w:b/>
+          <w:bCs/>
+        </w:rPr>
+        <w:t xml:space="preserve">A OR B = </w:t>
+      </w:r>
+      <w:proofErr w:type="gramStart"/>
+      <w:r>
+        <w:rPr>
+          <w:b/>
+          <w:bCs/>
+        </w:rPr>
+        <w:t>NOT(</w:t>
+      </w:r>
+      <w:proofErr w:type="gramEnd"/>
+      <w:r>
+        <w:rPr>
+          <w:b/>
+          <w:bCs/>
+        </w:rPr>
+        <w:t>NOT A AND NOT B)</w:t>
+      </w:r>
+      <w:r>
         <w:t>.</w:t>
       </w:r>
       <w:r>
-        <w:rPr>
-          <w:lang/>
-        </w:rPr>
         <w:br/>
-        <w:t>NAND с двумя одинаковыми входами даёт NOT, поэтому для OR достаточно трёх NAND.</w:t>
+        <w:t>NAND</w:t>
+      </w:r>
+      <w:r>
+        <w:rPr>
+          <w:lang w:val="ru-RU"/>
+        </w:rPr>
+        <w:t xml:space="preserve"> с двумя одинаковыми входами даёт </w:t>
+      </w:r>
+      <w:r>
+        <w:t>NOT</w:t>
+      </w:r>
+      <w:r>
+        <w:rPr>
+          <w:lang w:val="ru-RU"/>
+        </w:rPr>
+        <w:t xml:space="preserve">, поэтому для </w:t>
+      </w:r>
+      <w:r>
+        <w:t>OR</w:t>
+      </w:r>
+      <w:r>
+        <w:rPr>
+          <w:lang w:val="ru-RU"/>
+        </w:rPr>
+        <w:t xml:space="preserve"> достаточно трёх </w:t>
+      </w:r>
+      <w:r>
+        <w:t>NAND</w:t>
+      </w:r>
+      <w:r>
+        <w:rPr>
+          <w:lang w:val="ru-RU"/>
+        </w:rPr>
+        <w:t>.</w:t>
       </w:r>
     </w:p>
     <w:p>
       <w:pPr>
         <w:spacing w:after="60"/>
         <w:rPr>
-          <w:lang/>
+          <w:lang w:val="ru-RU"/>
         </w:rPr>
       </w:pPr>
       <w:r>
         <w:rPr>
           <w:b/>
           <w:bCs/>
-          <w:lang/>
-        </w:rPr>
+          <w:lang w:val="ru-RU"/>
+        </w:rPr>
+        <w:lastRenderedPageBreak/>
         <w:t>7. Быстродействие и количество элементов</w:t>
       </w:r>
       <w:r>
         <w:rPr>
-          <w:lang/>
+          <w:lang w:val="ru-RU"/>
         </w:rPr>
         <w:br/>
         <w:t>Параллельное вычисление позволяет быстро выбрать готовый результат. Но элементов нужно больше, потому что в схеме присутствуют блоки всех четырёх операций и мультиплексор.</w:t>
@@ -3221,21 +3390,20 @@
       <w:pPr>
         <w:spacing w:after="60"/>
         <w:rPr>
-          <w:lang/>
+          <w:lang w:val="ru-RU"/>
         </w:rPr>
       </w:pPr>
       <w:r>
         <w:rPr>
           <w:b/>
           <w:bCs/>
-          <w:lang/>
-        </w:rPr>
-        <w:lastRenderedPageBreak/>
+          <w:lang w:val="ru-RU"/>
+        </w:rPr>
         <w:t>8. Достаточно ли перебора?</w:t>
       </w:r>
       <w:r>
         <w:rPr>
-          <w:lang/>
+          <w:lang w:val="ru-RU"/>
         </w:rPr>
         <w:br/>
         <w:t>Для небольшой комбинационной схемы полный перебор всех входов и сравнение с правильной таблицей подтверждает её логическую правильность. Проверка только нескольких наборов этого не гарантирует. При этом симуляция не проверяет все особенности реального устройства, например электрические помехи.</w:t>

</xml_diff>